<commit_message>
Add RQ3 simulation results, tables, figures and Results/Discussion drafts
Full simulation completed (12 scenarios x 500 replicates plus a
200-replicate ntree sub-study; 6,200 replicates, no failures). Headline
findings: under MCAR and the mechanism calibrated to the survey's own
missingness all methods are unbiased; under strong MAR only IPW keeps
nominal coverage while complete-case analysis collapses (11% coverage at
50% missingness); under MNAR no method recovers the truth.

- Regenerated Tables 1-3 and S2-S5 and Figures 1, 2, S1, S2 from the full
  run; removed the superseded pilot outputs
- Added the RQ3 Results draft and filled the seven RQ3 placeholders in the
  Discussion
- Fixed 40_tables.R: gtsave/pandoc fails when the target .docx already
  exists, so previous outputs are now removed before writing

Co-Authored-By: Claude Opus 5 <noreply@anthropic.com>
</commit_message>
<xml_diff>
--- a/docs/manuscript/discussion_draft.docx
+++ b/docs/manuscript/discussion_draft.docx
@@ -47,39 +47,7 @@
         </w:numPr>
       </w:pPr>
       <w:r>
-        <w:rPr>
-          <w:b/>
-          <w:bCs/>
-        </w:rPr>
-        <w:t xml:space="preserve">RQ3 is not yet written.</w:t>
-      </w:r>
-      <w:r>
-        <w:t xml:space="preserve"> </w:t>
-      </w:r>
-      <w:r>
-        <w:t xml:space="preserve">The full simulation is still running. Paragraphs marked</w:t>
-      </w:r>
-      <w:r>
-        <w:t xml:space="preserve"> </w:t>
-      </w:r>
-      <w:r>
-        <w:rPr>
-          <w:b/>
-          <w:bCs/>
-        </w:rPr>
-        <w:t xml:space="preserve">[PENDING RQ3]</w:t>
-      </w:r>
-      <w:r>
-        <w:t xml:space="preserve"> </w:t>
-      </w:r>
-      <w:r>
-        <w:t xml:space="preserve">state only what the simulation was designed to test; they contain no findings</w:t>
-      </w:r>
-      <w:r>
-        <w:t xml:space="preserve"> </w:t>
-      </w:r>
-      <w:r>
-        <w:t xml:space="preserve">and must be rewritten from</w:t>
+        <w:t xml:space="preserve">RQ1/RQ2 statements are consistent with</w:t>
       </w:r>
       <w:r>
         <w:t xml:space="preserve"> </w:t>
@@ -88,19 +56,34 @@
         <w:rPr>
           <w:rStyle w:val="VerbatimChar"/>
         </w:rPr>
-        <w:t xml:space="preserve">rq3_performance_national_full.csv</w:t>
-      </w:r>
-      <w:r>
-        <w:t xml:space="preserve"> </w:t>
-      </w:r>
-      <w:r>
-        <w:t xml:space="preserve">and the related tables. The pilot</w:t>
-      </w:r>
-      <w:r>
-        <w:t xml:space="preserve"> </w:t>
-      </w:r>
-      <w:r>
-        <w:t xml:space="preserve">(20 replicates per scenario) is not reportable and is deliberately not used here.</w:t>
+        <w:t xml:space="preserve">results_rq1_rq2_draft.md</w:t>
+      </w:r>
+      <w:r>
+        <w:t xml:space="preserve"> </w:t>
+      </w:r>
+      <w:r>
+        <w:t xml:space="preserve">and RQ3 statements with</w:t>
+      </w:r>
+      <w:r>
+        <w:t xml:space="preserve"> </w:t>
+      </w:r>
+      <w:r>
+        <w:rPr>
+          <w:rStyle w:val="VerbatimChar"/>
+        </w:rPr>
+        <w:t xml:space="preserve">results_rq3_draft.md</w:t>
+      </w:r>
+      <w:r>
+        <w:t xml:space="preserve"> </w:t>
+      </w:r>
+      <w:r>
+        <w:t xml:space="preserve">(full run: 12 scenarios x 500 replicates, completed 16 September 2026).</w:t>
+      </w:r>
+      <w:r>
+        <w:t xml:space="preserve"> </w:t>
+      </w:r>
+      <w:r>
+        <w:t xml:space="preserve">Numbers are repeated only where needed for interpretation.</w:t>
       </w:r>
     </w:p>
     <w:p>
@@ -112,25 +95,23 @@
         </w:numPr>
       </w:pPr>
       <w:r>
-        <w:t xml:space="preserve">RQ1/RQ2 statements are consistent with</w:t>
+        <w:t xml:space="preserve">References continue the numbering of the Methods draft (1-20) and must be renumbered in order of</w:t>
+      </w:r>
+      <w:r>
+        <w:t xml:space="preserve"> </w:t>
+      </w:r>
+      <w:r>
+        <w:t xml:space="preserve">first citation when the manuscript is assembled.</w:t>
       </w:r>
       <w:r>
         <w:t xml:space="preserve"> </w:t>
       </w:r>
       <w:r>
         <w:rPr>
-          <w:rStyle w:val="VerbatimChar"/>
+          <w:b/>
+          <w:bCs/>
         </w:rPr>
-        <w:t xml:space="preserve">results_rq1_rq2_draft.md</w:t>
-      </w:r>
-      <w:r>
-        <w:t xml:space="preserve">; numbers are repeated only</w:t>
-      </w:r>
-      <w:r>
-        <w:t xml:space="preserve"> </w:t>
-      </w:r>
-      <w:r>
-        <w:t xml:space="preserve">where needed for interpretation.</w:t>
+        <w:t xml:space="preserve">Verify every reference before submission.</w:t>
       </w:r>
     </w:p>
     <w:p>
@@ -142,34 +123,6 @@
         </w:numPr>
       </w:pPr>
       <w:r>
-        <w:t xml:space="preserve">References continue the numbering of the Methods draft (1–20) and must be renumbered in order of</w:t>
-      </w:r>
-      <w:r>
-        <w:t xml:space="preserve"> </w:t>
-      </w:r>
-      <w:r>
-        <w:t xml:space="preserve">first citation when the manuscript is assembled.</w:t>
-      </w:r>
-      <w:r>
-        <w:t xml:space="preserve"> </w:t>
-      </w:r>
-      <w:r>
-        <w:rPr>
-          <w:b/>
-          <w:bCs/>
-        </w:rPr>
-        <w:t xml:space="preserve">Verify every reference before submission.</w:t>
-      </w:r>
-    </w:p>
-    <w:p>
-      <w:pPr>
-        <w:pStyle w:val="Compact"/>
-        <w:numPr>
-          <w:ilvl w:val="0"/>
-          <w:numId w:val="1001"/>
-        </w:numPr>
-      </w:pPr>
-      <w:r>
         <w:t xml:space="preserve">Items marked</w:t>
       </w:r>
       <w:r>
@@ -312,49 +265,55 @@
         <w:pStyle w:val="BodyText"/>
       </w:pPr>
       <w:r>
-        <w:rPr>
-          <w:b/>
-          <w:bCs/>
-        </w:rPr>
-        <w:t xml:space="preserve">[PENDING RQ3]</w:t>
-      </w:r>
-      <w:r>
-        <w:t xml:space="preserve"> </w:t>
-      </w:r>
-      <w:r>
-        <w:rPr>
-          <w:i/>
-          <w:iCs/>
-        </w:rPr>
-        <w:t xml:space="preserve">Summarise simulation findings here: bias and coverage of each method under MCAR,</w:t>
-      </w:r>
-      <w:r>
-        <w:rPr>
-          <w:i/>
-          <w:iCs/>
-        </w:rPr>
-        <w:t xml:space="preserve"> </w:t>
-      </w:r>
-      <w:r>
-        <w:rPr>
-          <w:i/>
-          <w:iCs/>
-        </w:rPr>
-        <w:t xml:space="preserve">calibrated MAR, strong MAR and MNAR at 10–50% missingness, and whether regional rankings were</w:t>
-      </w:r>
-      <w:r>
-        <w:rPr>
-          <w:i/>
-          <w:iCs/>
-        </w:rPr>
-        <w:t xml:space="preserve"> </w:t>
-      </w:r>
-      <w:r>
-        <w:rPr>
-          <w:i/>
-          <w:iCs/>
-        </w:rPr>
-        <w:t xml:space="preserve">recovered. Do not draft until the full run is summarised.</w:t>
+        <w:t xml:space="preserve">The simulation showed when that agreement can be expected and when it cannot. Under MCAR and under</w:t>
+      </w:r>
+      <w:r>
+        <w:t xml:space="preserve"> </w:t>
+      </w:r>
+      <w:r>
+        <w:t xml:space="preserve">the mechanism calibrated to the survey’s own missingness, all four methods were essentially unbiased</w:t>
+      </w:r>
+      <w:r>
+        <w:t xml:space="preserve"> </w:t>
+      </w:r>
+      <w:r>
+        <w:t xml:space="preserve">at 10-50% missingness, reproducing what we observed empirically. Under strong MAR, where missingness</w:t>
+      </w:r>
+      <w:r>
+        <w:t xml:space="preserve"> </w:t>
+      </w:r>
+      <w:r>
+        <w:t xml:space="preserve">depended on covariate-predicted undernutrition risk, the methods diverged sharply: at 50% missingness</w:t>
+      </w:r>
+      <w:r>
+        <w:t xml:space="preserve"> </w:t>
+      </w:r>
+      <w:r>
+        <w:t xml:space="preserve">complete-case analysis under-estimated stunting by 3.68 pp with 11% CI coverage, IPW was unbiased</w:t>
+      </w:r>
+      <w:r>
+        <w:t xml:space="preserve"> </w:t>
+      </w:r>
+      <w:r>
+        <w:t xml:space="preserve">(-0.04 pp) with 94.8% coverage, and multiple imputation removed most but not all of the bias</w:t>
+      </w:r>
+      <w:r>
+        <w:t xml:space="preserve"> </w:t>
+      </w:r>
+      <w:r>
+        <w:t xml:space="preserve">(-0.90 pp for MI-PMM, -1.69 pp for MI-RF). Under MNAR no method recovered the truth: all were biased</w:t>
+      </w:r>
+      <w:r>
+        <w:t xml:space="preserve"> </w:t>
+      </w:r>
+      <w:r>
+        <w:t xml:space="preserve">by about -10 pp at 50% missingness with zero coverage. Recovery of the regional ranking, by contrast,</w:t>
+      </w:r>
+      <w:r>
+        <w:t xml:space="preserve"> </w:t>
+      </w:r>
+      <w:r>
+        <w:t xml:space="preserve">was poor in every scenario, including with complete data.</w:t>
       </w:r>
     </w:p>
     <w:bookmarkEnd w:id="9"/>
@@ -516,49 +475,43 @@
         <w:pStyle w:val="BodyText"/>
       </w:pPr>
       <w:r>
-        <w:rPr>
-          <w:b/>
-          <w:bCs/>
-        </w:rPr>
-        <w:t xml:space="preserve">[PENDING RQ3]</w:t>
-      </w:r>
-      <w:r>
-        <w:t xml:space="preserve"> </w:t>
-      </w:r>
-      <w:r>
-        <w:rPr>
-          <w:i/>
-          <w:iCs/>
-        </w:rPr>
-        <w:t xml:space="preserve">Relate the simulation results to the observed-data findings, for example whether</w:t>
-      </w:r>
-      <w:r>
-        <w:rPr>
-          <w:i/>
-          <w:iCs/>
-        </w:rPr>
-        <w:t xml:space="preserve"> </w:t>
-      </w:r>
-      <w:r>
-        <w:rPr>
-          <w:i/>
-          <w:iCs/>
-        </w:rPr>
-        <w:t xml:space="preserve">the calibrated MAR scenario reproduced the near-zero bias observed empirically, and whether IPW and MI</w:t>
-      </w:r>
-      <w:r>
-        <w:rPr>
-          <w:i/>
-          <w:iCs/>
-        </w:rPr>
-        <w:t xml:space="preserve"> </w:t>
-      </w:r>
-      <w:r>
-        <w:rPr>
-          <w:i/>
-          <w:iCs/>
-        </w:rPr>
-        <w:t xml:space="preserve">removed bias under strong MAR as expected in principle. Do not draft until results exist.</w:t>
+        <w:t xml:space="preserve">The simulation supports this reading. The mechanism calibrated to the survey’s own missingness</w:t>
+      </w:r>
+      <w:r>
+        <w:t xml:space="preserve"> </w:t>
+      </w:r>
+      <w:r>
+        <w:t xml:space="preserve">produced almost no bias in complete-case estimates (at most 0.09 pp for stunting at 50% missingness),</w:t>
+      </w:r>
+      <w:r>
+        <w:t xml:space="preserve"> </w:t>
+      </w:r>
+      <w:r>
+        <w:t xml:space="preserve">which is why the methods agreed on the observed data. Selective missingness only became consequential</w:t>
+      </w:r>
+      <w:r>
+        <w:t xml:space="preserve"> </w:t>
+      </w:r>
+      <w:r>
+        <w:t xml:space="preserve">when it was tied to the outcome’s own predictors: the strong-MAR mechanism, with the same structure</w:t>
+      </w:r>
+      <w:r>
+        <w:t xml:space="preserve"> </w:t>
+      </w:r>
+      <w:r>
+        <w:t xml:space="preserve">and strength but driven by predicted undernutrition risk, produced complete-case bias of -2.18 pp at</w:t>
+      </w:r>
+      <w:r>
+        <w:t xml:space="preserve"> </w:t>
+      </w:r>
+      <w:r>
+        <w:t xml:space="preserve">30% missingness. The practical implication is that the observed agreement is a property of this</w:t>
+      </w:r>
+      <w:r>
+        <w:t xml:space="preserve"> </w:t>
+      </w:r>
+      <w:r>
+        <w:t xml:space="preserve">survey’s missingness pattern, not a general result.</w:t>
       </w:r>
     </w:p>
     <w:bookmarkEnd w:id="10"/>
@@ -653,7 +606,6 @@
     </w:p>
     <w:p>
       <w:pPr>
-        <w:pStyle w:val="Compact"/>
         <w:numPr>
           <w:ilvl w:val="0"/>
           <w:numId w:val="1002"/>
@@ -693,7 +645,6 @@
     </w:p>
     <w:p>
       <w:pPr>
-        <w:pStyle w:val="Compact"/>
         <w:numPr>
           <w:ilvl w:val="0"/>
           <w:numId w:val="1002"/>
@@ -727,7 +678,6 @@
     </w:p>
     <w:p>
       <w:pPr>
-        <w:pStyle w:val="Compact"/>
         <w:numPr>
           <w:ilvl w:val="0"/>
           <w:numId w:val="1002"/>
@@ -779,72 +729,87 @@
     </w:p>
     <w:p>
       <w:pPr>
-        <w:pStyle w:val="FirstParagraph"/>
-      </w:pPr>
-      <w:r>
-        <w:t xml:space="preserve">Where ranking precision is itself the problem, borrowing strength across areas through small-area</w:t>
-      </w:r>
-      <w:r>
-        <w:t xml:space="preserve"> </w:t>
-      </w:r>
-      <w:r>
-        <w:t xml:space="preserve">estimation methods may be more useful than refining the treatment of a few percent of missing</w:t>
-      </w:r>
-      <w:r>
-        <w:t xml:space="preserve"> </w:t>
-      </w:r>
-      <w:r>
-        <w:t xml:space="preserve">outcomes [29].</w:t>
-      </w:r>
-    </w:p>
-    <w:p>
-      <w:pPr>
-        <w:pStyle w:val="BodyText"/>
+        <w:numPr>
+          <w:ilvl w:val="0"/>
+          <w:numId w:val="1002"/>
+        </w:numPr>
       </w:pPr>
       <w:r>
         <w:rPr>
           <w:b/>
           <w:bCs/>
         </w:rPr>
-        <w:t xml:space="preserve">[PENDING RQ3]</w:t>
-      </w:r>
-      <w:r>
-        <w:t xml:space="preserve"> </w:t>
+        <w:t xml:space="preserve">Prefer response weighting, or imputation with well-calibrated variance, when missingness is</w:t>
       </w:r>
       <w:r>
         <w:rPr>
-          <w:i/>
-          <w:iCs/>
+          <w:b/>
+          <w:bCs/>
         </w:rPr>
-        <w:t xml:space="preserve">If the simulation shows material bias or undercoverage for any method under</w:t>
+        <w:t xml:space="preserve"> </w:t>
       </w:r>
       <w:r>
         <w:rPr>
-          <w:i/>
-          <w:iCs/>
+          <w:b/>
+          <w:bCs/>
         </w:rPr>
-        <w:t xml:space="preserve"> </w:t>
-      </w:r>
-      <w:r>
-        <w:rPr>
-          <w:i/>
-          <w:iCs/>
-        </w:rPr>
-        <w:t xml:space="preserve">plausible mechanisms, add the corresponding recommendation here, for example on MI-RF variance or on</w:t>
-      </w:r>
-      <w:r>
-        <w:rPr>
-          <w:i/>
-          <w:iCs/>
-        </w:rPr>
-        <w:t xml:space="preserve"> </w:t>
-      </w:r>
-      <w:r>
-        <w:rPr>
-          <w:i/>
-          <w:iCs/>
-        </w:rPr>
-        <w:t xml:space="preserve">MNAR sensitivity analysis.</w:t>
+        <w:t xml:space="preserve">selective.</w:t>
+      </w:r>
+      <w:r>
+        <w:t xml:space="preserve"> </w:t>
+      </w:r>
+      <w:r>
+        <w:t xml:space="preserve">In the simulation IPW was the only method that stayed unbiased with nominal coverage</w:t>
+      </w:r>
+      <w:r>
+        <w:t xml:space="preserve"> </w:t>
+      </w:r>
+      <w:r>
+        <w:t xml:space="preserve">under strong MAR, while both imputation approaches retained residual bias. MI-RF additionally</w:t>
+      </w:r>
+      <w:r>
+        <w:t xml:space="preserve"> </w:t>
+      </w:r>
+      <w:r>
+        <w:t xml:space="preserve">understated uncertainty: its standard errors were 13-19% too small in the highest-missingness</w:t>
+      </w:r>
+      <w:r>
+        <w:t xml:space="preserve"> </w:t>
+      </w:r>
+      <w:r>
+        <w:t xml:space="preserve">scenarios, and coverage fell to 63% under strong MAR at 50% missingness. Where random-forest</w:t>
+      </w:r>
+      <w:r>
+        <w:t xml:space="preserve"> </w:t>
+      </w:r>
+      <w:r>
+        <w:t xml:space="preserve">imputation is used, the number of trees should be checked: raising it from 10 (the mice default)</w:t>
+      </w:r>
+      <w:r>
+        <w:t xml:space="preserve"> </w:t>
+      </w:r>
+      <w:r>
+        <w:t xml:space="preserve">to 50 restored calibration in our sub-study, though it did not remove the bias.</w:t>
+      </w:r>
+    </w:p>
+    <w:p>
+      <w:pPr>
+        <w:pStyle w:val="FirstParagraph"/>
+      </w:pPr>
+      <w:r>
+        <w:t xml:space="preserve">Where ranking precision is itself the problem, borrowing strength across areas through small-area</w:t>
+      </w:r>
+      <w:r>
+        <w:t xml:space="preserve"> </w:t>
+      </w:r>
+      <w:r>
+        <w:t xml:space="preserve">estimation methods may be more useful than refining the treatment of a few percent of missing</w:t>
+      </w:r>
+      <w:r>
+        <w:t xml:space="preserve"> </w:t>
+      </w:r>
+      <w:r>
+        <w:t xml:space="preserve">outcomes [29].</w:t>
       </w:r>
     </w:p>
     <w:bookmarkEnd w:id="12"/>
@@ -1056,41 +1021,25 @@
         <w:t xml:space="preserve"> </w:t>
       </w:r>
       <w:r>
-        <w:t xml:space="preserve">models [31], would complement this work.</w:t>
-      </w:r>
-      <w:r>
-        <w:t xml:space="preserve"> </w:t>
-      </w:r>
-      <w:r>
-        <w:rPr>
-          <w:b/>
-          <w:bCs/>
-        </w:rPr>
-        <w:t xml:space="preserve">[PENDING RQ3]</w:t>
-      </w:r>
-      <w:r>
-        <w:t xml:space="preserve"> </w:t>
-      </w:r>
-      <w:r>
-        <w:rPr>
-          <w:i/>
-          <w:iCs/>
-        </w:rPr>
-        <w:t xml:space="preserve">Note what the MNAR simulation adds or</w:t>
-      </w:r>
-      <w:r>
-        <w:rPr>
-          <w:i/>
-          <w:iCs/>
-        </w:rPr>
-        <w:t xml:space="preserve"> </w:t>
-      </w:r>
-      <w:r>
-        <w:rPr>
-          <w:i/>
-          <w:iCs/>
-        </w:rPr>
-        <w:t xml:space="preserve">does not add here.</w:t>
+        <w:t xml:space="preserve">models [31], would complement this work. The MNAR simulation quantifies what is at stake rather</w:t>
+      </w:r>
+      <w:r>
+        <w:t xml:space="preserve"> </w:t>
+      </w:r>
+      <w:r>
+        <w:t xml:space="preserve">than resolving it: when missingness depended on the z-score itself, every method was biased by a</w:t>
+      </w:r>
+      <w:r>
+        <w:t xml:space="preserve"> </w:t>
+      </w:r>
+      <w:r>
+        <w:t xml:space="preserve">similar amount and no confidence interval covered the truth at 30% missingness or above, with IPW</w:t>
+      </w:r>
+      <w:r>
+        <w:t xml:space="preserve"> </w:t>
+      </w:r>
+      <w:r>
+        <w:t xml:space="preserve">and MI reducing complete-case bias by at most 8%.</w:t>
       </w:r>
     </w:p>
     <w:p>
@@ -1220,55 +1169,19 @@
         <w:t xml:space="preserve"> </w:t>
       </w:r>
       <w:r>
-        <w:t xml:space="preserve">with higher or differently structured missingness.</w:t>
-      </w:r>
-      <w:r>
-        <w:t xml:space="preserve"> </w:t>
-      </w:r>
-      <w:r>
-        <w:rPr>
-          <w:b/>
-          <w:bCs/>
-        </w:rPr>
-        <w:t xml:space="preserve">[PENDING RQ3]</w:t>
-      </w:r>
-      <w:r>
-        <w:t xml:space="preserve"> </w:t>
-      </w:r>
-      <w:r>
-        <w:rPr>
-          <w:i/>
-          <w:iCs/>
-        </w:rPr>
-        <w:t xml:space="preserve">The simulation addresses higher</w:t>
-      </w:r>
-      <w:r>
-        <w:rPr>
-          <w:i/>
-          <w:iCs/>
-        </w:rPr>
-        <w:t xml:space="preserve"> </w:t>
-      </w:r>
-      <w:r>
-        <w:rPr>
-          <w:i/>
-          <w:iCs/>
-        </w:rPr>
-        <w:t xml:space="preserve">missingness; state here how far it does so, and note that the HAZ-only missingness pattern (1.2% of</w:t>
-      </w:r>
-      <w:r>
-        <w:rPr>
-          <w:i/>
-          <w:iCs/>
-        </w:rPr>
-        <w:t xml:space="preserve"> </w:t>
-      </w:r>
-      <w:r>
-        <w:rPr>
-          <w:i/>
-          <w:iCs/>
-        </w:rPr>
-        <w:t xml:space="preserve">children) was not simulated.</w:t>
+        <w:t xml:space="preserve">with higher or differently structured missingness. The simulation extends the range of missingness</w:t>
+      </w:r>
+      <w:r>
+        <w:t xml:space="preserve"> </w:t>
+      </w:r>
+      <w:r>
+        <w:t xml:space="preserve">studied to 50%, but within the same pseudo-population and design, and it deletes HAZ and WHZ</w:t>
+      </w:r>
+      <w:r>
+        <w:t xml:space="preserve"> </w:t>
+      </w:r>
+      <w:r>
+        <w:t xml:space="preserve">together; the smaller HAZ-only pattern seen in the survey (1.2% of children) was not simulated.</w:t>
       </w:r>
     </w:p>
     <w:bookmarkEnd w:id="13"/>
@@ -1316,21 +1229,31 @@
         <w:t xml:space="preserve"> </w:t>
       </w:r>
       <w:r>
-        <w:rPr>
-          <w:b/>
-          <w:bCs/>
-        </w:rPr>
-        <w:t xml:space="preserve">[PENDING RQ3]</w:t>
-      </w:r>
-      <w:r>
-        <w:t xml:space="preserve"> </w:t>
-      </w:r>
-      <w:r>
-        <w:rPr>
-          <w:i/>
-          <w:iCs/>
-        </w:rPr>
-        <w:t xml:space="preserve">Add one or two sentences on the simulation findings.</w:t>
+        <w:t xml:space="preserve">In simulation, this equivalence held under missingness completely at random and under the mechanism</w:t>
+      </w:r>
+      <w:r>
+        <w:t xml:space="preserve"> </w:t>
+      </w:r>
+      <w:r>
+        <w:t xml:space="preserve">calibrated to the survey, but not when missingness was strongly tied to covariate-predicted</w:t>
+      </w:r>
+      <w:r>
+        <w:t xml:space="preserve"> </w:t>
+      </w:r>
+      <w:r>
+        <w:t xml:space="preserve">undernutrition risk: there only inverse probability weighting remained unbiased with valid coverage,</w:t>
+      </w:r>
+      <w:r>
+        <w:t xml:space="preserve"> </w:t>
+      </w:r>
+      <w:r>
+        <w:t xml:space="preserve">while complete-case analysis was substantially biased. No method compensated for missingness that</w:t>
+      </w:r>
+      <w:r>
+        <w:t xml:space="preserve"> </w:t>
+      </w:r>
+      <w:r>
+        <w:t xml:space="preserve">depended on the measurement itself.</w:t>
       </w:r>
     </w:p>
     <w:bookmarkEnd w:id="14"/>

</xml_diff>